<commit_message>
Resolve font issue for No progression letter
</commit_message>
<xml_diff>
--- a/arches_her/docx/No progression letter.docx
+++ b/arches_her/docx/No progression letter.docx
@@ -622,8 +622,14 @@
         <w:tabs>
           <w:tab w:val="clear" w:pos="5245"/>
         </w:tabs>
+        <w:rPr>
+          <w:rFonts w:asciiTheme="minorHAnsi" w:hAnsiTheme="minorHAnsi" w:cstheme="minorHAnsi"/>
+        </w:rPr>
       </w:pPr>
       <w:r>
+        <w:rPr>
+          <w:rFonts w:asciiTheme="minorHAnsi" w:hAnsiTheme="minorHAnsi" w:cstheme="minorHAnsi"/>
+        </w:rPr>
         <w:t>&lt;Archaeological Priority Area&gt;</w:t>
       </w:r>
     </w:p>
@@ -2857,26 +2863,10 @@
 </file>
 
 <file path=customXml/item1.xml><?xml version="1.0" encoding="utf-8"?>
-<p:properties xmlns:p="http://schemas.microsoft.com/office/2006/metadata/properties" xmlns:xsi="http://www.w3.org/2001/XMLSchema-instance" xmlns:pc="http://schemas.microsoft.com/office/infopath/2007/PartnerControls">
-  <documentManagement>
-    <lcf76f155ced4ddcb4097134ff3c332f xmlns="e789b7fa-a83c-4c6b-9e01-87c723f67228">
-      <Terms xmlns="http://schemas.microsoft.com/office/infopath/2007/PartnerControls"/>
-    </lcf76f155ced4ddcb4097134ff3c332f>
-    <TaxCatchAll xmlns="bb952b06-3268-4e55-b0fe-9eb49669fc08" xsi:nil="true"/>
-  </documentManagement>
-</p:properties>
+<b:Sources xmlns:b="http://schemas.openxmlformats.org/officeDocument/2006/bibliography" xmlns="http://schemas.openxmlformats.org/officeDocument/2006/bibliography" SelectedStyle="/APASixthEditionOfficeOnline.xsl" StyleName="APA" Version="6"/>
 </file>
 
 <file path=customXml/item2.xml><?xml version="1.0" encoding="utf-8"?>
-<?mso-contentType ?>
-<FormTemplates xmlns="http://schemas.microsoft.com/sharepoint/v3/contenttype/forms">
-  <Display>DocumentLibraryForm</Display>
-  <Edit>DocumentLibraryForm</Edit>
-  <New>DocumentLibraryForm</New>
-</FormTemplates>
-</file>
-
-<file path=customXml/item3.xml><?xml version="1.0" encoding="utf-8"?>
 <ct:contentTypeSchema xmlns:ct="http://schemas.microsoft.com/office/2006/metadata/contentType" xmlns:ma="http://schemas.microsoft.com/office/2006/metadata/properties/metaAttributes" ct:_="" ma:_="" ma:contentTypeName="Document" ma:contentTypeID="0x010100B89331DE8EA64F4FBEA00113BF0E4514" ma:contentTypeVersion="11" ma:contentTypeDescription="Create a new document." ma:contentTypeScope="" ma:versionID="0b60b04e60edb8b2e7e2fe1cc7d413e0">
   <xsd:schema xmlns:xsd="http://www.w3.org/2001/XMLSchema" xmlns:xs="http://www.w3.org/2001/XMLSchema" xmlns:p="http://schemas.microsoft.com/office/2006/metadata/properties" xmlns:ns2="e789b7fa-a83c-4c6b-9e01-87c723f67228" xmlns:ns3="bb952b06-3268-4e55-b0fe-9eb49669fc08" targetNamespace="http://schemas.microsoft.com/office/2006/metadata/properties" ma:root="true" ma:fieldsID="52467e30880403e5f73a15b97b0992c8" ns2:_="" ns3:_="">
     <xsd:import namespace="e789b7fa-a83c-4c6b-9e01-87c723f67228"/>
@@ -3071,30 +3061,35 @@
 </ct:contentTypeSchema>
 </file>
 
+<file path=customXml/item3.xml><?xml version="1.0" encoding="utf-8"?>
+<?mso-contentType ?>
+<FormTemplates xmlns="http://schemas.microsoft.com/sharepoint/v3/contenttype/forms">
+  <Display>DocumentLibraryForm</Display>
+  <Edit>DocumentLibraryForm</Edit>
+  <New>DocumentLibraryForm</New>
+</FormTemplates>
+</file>
+
 <file path=customXml/item4.xml><?xml version="1.0" encoding="utf-8"?>
-<b:Sources xmlns:b="http://schemas.openxmlformats.org/officeDocument/2006/bibliography" xmlns="http://schemas.openxmlformats.org/officeDocument/2006/bibliography" SelectedStyle="/APASixthEditionOfficeOnline.xsl" StyleName="APA" Version="6"/>
+<p:properties xmlns:p="http://schemas.microsoft.com/office/2006/metadata/properties" xmlns:xsi="http://www.w3.org/2001/XMLSchema-instance" xmlns:pc="http://schemas.microsoft.com/office/infopath/2007/PartnerControls">
+  <documentManagement>
+    <lcf76f155ced4ddcb4097134ff3c332f xmlns="e789b7fa-a83c-4c6b-9e01-87c723f67228">
+      <Terms xmlns="http://schemas.microsoft.com/office/infopath/2007/PartnerControls"/>
+    </lcf76f155ced4ddcb4097134ff3c332f>
+    <TaxCatchAll xmlns="bb952b06-3268-4e55-b0fe-9eb49669fc08" xsi:nil="true"/>
+  </documentManagement>
+</p:properties>
 </file>
 
 <file path=customXml/itemProps1.xml><?xml version="1.0" encoding="utf-8"?>
-<ds:datastoreItem xmlns:ds="http://schemas.openxmlformats.org/officeDocument/2006/customXml" ds:itemID="{EF43FDED-CD1D-4301-B761-71C1DCC851CC}">
+<ds:datastoreItem xmlns:ds="http://schemas.openxmlformats.org/officeDocument/2006/customXml" ds:itemID="{3B4892E8-18D6-D444-BA6E-299F0B60384F}">
   <ds:schemaRefs>
-    <ds:schemaRef ds:uri="http://schemas.microsoft.com/office/2006/metadata/properties"/>
-    <ds:schemaRef ds:uri="http://schemas.microsoft.com/office/infopath/2007/PartnerControls"/>
-    <ds:schemaRef ds:uri="e789b7fa-a83c-4c6b-9e01-87c723f67228"/>
-    <ds:schemaRef ds:uri="bb952b06-3268-4e55-b0fe-9eb49669fc08"/>
+    <ds:schemaRef ds:uri="http://schemas.openxmlformats.org/officeDocument/2006/bibliography"/>
   </ds:schemaRefs>
 </ds:datastoreItem>
 </file>
 
 <file path=customXml/itemProps2.xml><?xml version="1.0" encoding="utf-8"?>
-<ds:datastoreItem xmlns:ds="http://schemas.openxmlformats.org/officeDocument/2006/customXml" ds:itemID="{45FB1F57-968F-4A6E-AEE9-65961EB5FADD}">
-  <ds:schemaRefs>
-    <ds:schemaRef ds:uri="http://schemas.microsoft.com/sharepoint/v3/contenttype/forms"/>
-  </ds:schemaRefs>
-</ds:datastoreItem>
-</file>
-
-<file path=customXml/itemProps3.xml><?xml version="1.0" encoding="utf-8"?>
 <ds:datastoreItem xmlns:ds="http://schemas.openxmlformats.org/officeDocument/2006/customXml" ds:itemID="{93F00A47-6514-4C46-91C6-8D2331E8318E}">
   <ds:schemaRefs>
     <ds:schemaRef ds:uri="http://schemas.microsoft.com/office/2006/metadata/contentType"/>
@@ -3113,10 +3108,21 @@
 </ds:datastoreItem>
 </file>
 
+<file path=customXml/itemProps3.xml><?xml version="1.0" encoding="utf-8"?>
+<ds:datastoreItem xmlns:ds="http://schemas.openxmlformats.org/officeDocument/2006/customXml" ds:itemID="{45FB1F57-968F-4A6E-AEE9-65961EB5FADD}">
+  <ds:schemaRefs>
+    <ds:schemaRef ds:uri="http://schemas.microsoft.com/sharepoint/v3/contenttype/forms"/>
+  </ds:schemaRefs>
+</ds:datastoreItem>
+</file>
+
 <file path=customXml/itemProps4.xml><?xml version="1.0" encoding="utf-8"?>
-<ds:datastoreItem xmlns:ds="http://schemas.openxmlformats.org/officeDocument/2006/customXml" ds:itemID="{3B4892E8-18D6-D444-BA6E-299F0B60384F}">
+<ds:datastoreItem xmlns:ds="http://schemas.openxmlformats.org/officeDocument/2006/customXml" ds:itemID="{EF43FDED-CD1D-4301-B761-71C1DCC851CC}">
   <ds:schemaRefs>
-    <ds:schemaRef ds:uri="http://schemas.openxmlformats.org/officeDocument/2006/bibliography"/>
+    <ds:schemaRef ds:uri="http://schemas.microsoft.com/office/2006/metadata/properties"/>
+    <ds:schemaRef ds:uri="http://schemas.microsoft.com/office/infopath/2007/PartnerControls"/>
+    <ds:schemaRef ds:uri="e789b7fa-a83c-4c6b-9e01-87c723f67228"/>
+    <ds:schemaRef ds:uri="bb952b06-3268-4e55-b0fe-9eb49669fc08"/>
   </ds:schemaRefs>
 </ds:datastoreItem>
 </file>
</xml_diff>